<commit_message>
Spell out each day's activity on the Oct 13-15 certificate
Oct 13: roundtable discussion at the Capitol Executive Conference Room.
Oct 14-15: FGDs and workshop with people's organizations at the PENRO
Sibugay Conference Room (venue per the PO invitation letter).

Co-Authored-By: Claude Opus 5.5 <noreply@anthropic.com>
Claude-Session: https://claude.ai/code/session_01MEgufMS77RQta5GCdBU3cy
</commit_message>
<xml_diff>
--- a/certificates/Certificate_of_Appearance_ADB_Roundtable_2026-10-13_to_15.docx
+++ b/certificates/Certificate_of_Appearance_ADB_Roundtable_2026-10-13_to_15.docx
@@ -86,7 +86,7 @@
           </w:p>
           <w:p>
             <w:pPr>
-              <w:spacing w:after="300" w:before="60"/>
+              <w:spacing w:after="240" w:before="40"/>
               <w:jc w:val="center"/>
             </w:pPr>
             <w:r>
@@ -250,7 +250,7 @@
                 <w:sz w:val="23"/>
                 <w:szCs w:val="23"/>
               </w:rPr>
-              <w:t xml:space="preserve"> held from </w:t>
+              <w:t xml:space="preserve"> on </w:t>
             </w:r>
             <w:r>
               <w:rPr>
@@ -260,15 +260,51 @@
                 <w:sz w:val="23"/>
                 <w:szCs w:val="23"/>
               </w:rPr>
-              <w:t xml:space="preserve">October 13 to 15, 2026</w:t>
-            </w:r>
-            <w:r>
-              <w:rPr>
-                <w:rFonts w:ascii="Times New Roman" w:cs="Times New Roman" w:eastAsia="Times New Roman" w:hAnsi="Times New Roman"/>
-                <w:sz w:val="23"/>
-                <w:szCs w:val="23"/>
-              </w:rPr>
-              <w:t xml:space="preserve"> at the Executive Conference Room, Provincial Capitol Building, Ipil, Zamboanga Sibugay.</w:t>
+              <w:t xml:space="preserve">October 13, 2026</w:t>
+            </w:r>
+            <w:r>
+              <w:rPr>
+                <w:rFonts w:ascii="Times New Roman" w:cs="Times New Roman" w:eastAsia="Times New Roman" w:hAnsi="Times New Roman"/>
+                <w:sz w:val="23"/>
+                <w:szCs w:val="23"/>
+              </w:rPr>
+              <w:t xml:space="preserve"> at the Executive Conference Room, Provincial Capitol Building, Ipil, Zamboanga Sibugay; and in the </w:t>
+            </w:r>
+            <w:r>
+              <w:rPr>
+                <w:rFonts w:ascii="Times New Roman" w:cs="Times New Roman" w:eastAsia="Times New Roman" w:hAnsi="Times New Roman"/>
+                <w:b/>
+                <w:bCs/>
+                <w:sz w:val="23"/>
+                <w:szCs w:val="23"/>
+              </w:rPr>
+              <w:t xml:space="preserve">Focus Group Discussions and Workshop with People’s Organizations</w:t>
+            </w:r>
+            <w:r>
+              <w:rPr>
+                <w:rFonts w:ascii="Times New Roman" w:cs="Times New Roman" w:eastAsia="Times New Roman" w:hAnsi="Times New Roman"/>
+                <w:sz w:val="23"/>
+                <w:szCs w:val="23"/>
+              </w:rPr>
+              <w:t xml:space="preserve"> on </w:t>
+            </w:r>
+            <w:r>
+              <w:rPr>
+                <w:rFonts w:ascii="Times New Roman" w:cs="Times New Roman" w:eastAsia="Times New Roman" w:hAnsi="Times New Roman"/>
+                <w:b/>
+                <w:bCs/>
+                <w:sz w:val="23"/>
+                <w:szCs w:val="23"/>
+              </w:rPr>
+              <w:t xml:space="preserve">October 14 and October 15, 2026</w:t>
+            </w:r>
+            <w:r>
+              <w:rPr>
+                <w:rFonts w:ascii="Times New Roman" w:cs="Times New Roman" w:eastAsia="Times New Roman" w:hAnsi="Times New Roman"/>
+                <w:sz w:val="23"/>
+                <w:szCs w:val="23"/>
+              </w:rPr>
+              <w:t xml:space="preserve"> at the PENRO Sibugay Conference Room, Ipil, Zamboanga Sibugay.</w:t>
             </w:r>
           </w:p>
           <w:p>
@@ -288,7 +324,7 @@
           </w:p>
           <w:p>
             <w:pPr>
-              <w:spacing w:after="900"/>
+              <w:spacing w:after="650"/>
               <w:ind w:firstLine="720"/>
             </w:pPr>
             <w:r>
@@ -412,7 +448,7 @@
               <w:right w:val="none" w:color="FFFFFF" w:sz="0"/>
             </w:tcBorders>
             <w:tcMar>
-              <w:top w:type="dxa" w:w="560"/>
+              <w:top w:type="dxa" w:w="400"/>
               <w:left w:type="dxa" w:w="0"/>
               <w:bottom w:type="dxa" w:w="0"/>
               <w:right w:type="dxa" w:w="0"/>
@@ -466,7 +502,7 @@
           </w:p>
           <w:p>
             <w:pPr>
-              <w:spacing w:after="300" w:before="60"/>
+              <w:spacing w:after="240" w:before="40"/>
               <w:jc w:val="center"/>
             </w:pPr>
             <w:r>
@@ -630,7 +666,7 @@
                 <w:sz w:val="23"/>
                 <w:szCs w:val="23"/>
               </w:rPr>
-              <w:t xml:space="preserve"> held from </w:t>
+              <w:t xml:space="preserve"> on </w:t>
             </w:r>
             <w:r>
               <w:rPr>
@@ -640,15 +676,51 @@
                 <w:sz w:val="23"/>
                 <w:szCs w:val="23"/>
               </w:rPr>
-              <w:t xml:space="preserve">October 13 to 15, 2026</w:t>
-            </w:r>
-            <w:r>
-              <w:rPr>
-                <w:rFonts w:ascii="Times New Roman" w:cs="Times New Roman" w:eastAsia="Times New Roman" w:hAnsi="Times New Roman"/>
-                <w:sz w:val="23"/>
-                <w:szCs w:val="23"/>
-              </w:rPr>
-              <w:t xml:space="preserve"> at the Executive Conference Room, Provincial Capitol Building, Ipil, Zamboanga Sibugay.</w:t>
+              <w:t xml:space="preserve">October 13, 2026</w:t>
+            </w:r>
+            <w:r>
+              <w:rPr>
+                <w:rFonts w:ascii="Times New Roman" w:cs="Times New Roman" w:eastAsia="Times New Roman" w:hAnsi="Times New Roman"/>
+                <w:sz w:val="23"/>
+                <w:szCs w:val="23"/>
+              </w:rPr>
+              <w:t xml:space="preserve"> at the Executive Conference Room, Provincial Capitol Building, Ipil, Zamboanga Sibugay; and in the </w:t>
+            </w:r>
+            <w:r>
+              <w:rPr>
+                <w:rFonts w:ascii="Times New Roman" w:cs="Times New Roman" w:eastAsia="Times New Roman" w:hAnsi="Times New Roman"/>
+                <w:b/>
+                <w:bCs/>
+                <w:sz w:val="23"/>
+                <w:szCs w:val="23"/>
+              </w:rPr>
+              <w:t xml:space="preserve">Focus Group Discussions and Workshop with People’s Organizations</w:t>
+            </w:r>
+            <w:r>
+              <w:rPr>
+                <w:rFonts w:ascii="Times New Roman" w:cs="Times New Roman" w:eastAsia="Times New Roman" w:hAnsi="Times New Roman"/>
+                <w:sz w:val="23"/>
+                <w:szCs w:val="23"/>
+              </w:rPr>
+              <w:t xml:space="preserve"> on </w:t>
+            </w:r>
+            <w:r>
+              <w:rPr>
+                <w:rFonts w:ascii="Times New Roman" w:cs="Times New Roman" w:eastAsia="Times New Roman" w:hAnsi="Times New Roman"/>
+                <w:b/>
+                <w:bCs/>
+                <w:sz w:val="23"/>
+                <w:szCs w:val="23"/>
+              </w:rPr>
+              <w:t xml:space="preserve">October 14 and October 15, 2026</w:t>
+            </w:r>
+            <w:r>
+              <w:rPr>
+                <w:rFonts w:ascii="Times New Roman" w:cs="Times New Roman" w:eastAsia="Times New Roman" w:hAnsi="Times New Roman"/>
+                <w:sz w:val="23"/>
+                <w:szCs w:val="23"/>
+              </w:rPr>
+              <w:t xml:space="preserve"> at the PENRO Sibugay Conference Room, Ipil, Zamboanga Sibugay.</w:t>
             </w:r>
           </w:p>
           <w:p>
@@ -668,7 +740,7 @@
           </w:p>
           <w:p>
             <w:pPr>
-              <w:spacing w:after="900"/>
+              <w:spacing w:after="650"/>
               <w:ind w:firstLine="720"/>
             </w:pPr>
             <w:r>

</xml_diff>